<commit_message>
Résumé: drop Projects and Clubs sections; let the remaining content breathe
Projects and clubs live on the site instead. With two sections gone,
relaxed the compressed type/spacing back to a comfortable one-page
layout (HTML + docx + preview.pdf regenerated).
</commit_message>
<xml_diff>
--- a/resume/Gabriel-Harlan-Resume.docx
+++ b/resume/Gabriel-Harlan-Resume.docx
@@ -618,267 +618,6 @@
               <w:t>Logged and tracked issues in ticketing systems, producing customer and lab reports.</w:t>
             </w:r>
           </w:p>
-          <w:p>
-            <w:pPr>
-              <w:spacing w:before="180" w:after="60"/>
-            </w:pPr>
-            <w:r>
-              <w:rPr>
-                <w:rFonts w:ascii="Space Mono" w:hAnsi="Space Mono"/>
-                <w:b/>
-                <w:i w:val="0"/>
-                <w:color w:val="C08800"/>
-                <w:sz w:val="18"/>
-              </w:rPr>
-              <w:t xml:space="preserve">■ </w:t>
-            </w:r>
-            <w:r>
-              <w:rPr>
-                <w:rFonts w:ascii="Space Mono" w:hAnsi="Space Mono"/>
-                <w:b/>
-                <w:i w:val="0"/>
-                <w:color w:val="211B14"/>
-                <w:sz w:val="18"/>
-              </w:rPr>
-              <w:t>SELECTED WORK</w:t>
-            </w:r>
-          </w:p>
-          <w:p>
-            <w:pPr>
-              <w:tabs>
-                <w:tab w:pos="6480" w:val="right"/>
-              </w:tabs>
-              <w:spacing w:before="80"/>
-            </w:pPr>
-            <w:r>
-              <w:rPr>
-                <w:rFonts w:ascii="Fraunces" w:hAnsi="Fraunces"/>
-                <w:b/>
-                <w:i w:val="0"/>
-                <w:color w:val="211B14"/>
-                <w:sz w:val="22"/>
-              </w:rPr>
-              <w:t>Karst — Cave Field Guide</w:t>
-            </w:r>
-            <w:r>
-              <w:rPr>
-                <w:rFonts w:ascii="Space Mono" w:hAnsi="Space Mono"/>
-                <w:b w:val="0"/>
-                <w:i w:val="0"/>
-                <w:color w:val="5A4F41"/>
-                <w:sz w:val="15"/>
-              </w:rPr>
-              <w:tab/>
-              <w:t>2026</w:t>
-            </w:r>
-          </w:p>
-          <w:p>
-            <w:pPr>
-              <w:spacing w:after="0" w:line="269" w:lineRule="auto"/>
-            </w:pPr>
-            <w:r>
-              <w:rPr>
-                <w:rFonts w:ascii="Schibsted Grotesk" w:hAnsi="Schibsted Grotesk"/>
-                <w:b w:val="0"/>
-                <w:i w:val="0"/>
-                <w:color w:val="5A4F41"/>
-                <w:sz w:val="17"/>
-              </w:rPr>
-              <w:t>A caver's field guide to southern Indiana's karst country — a privacy-first map that fuzzes sensitive cave locations, a community field guide, and a bat / White-Nose Syndrome conservation guide. Web + Android.</w:t>
-            </w:r>
-          </w:p>
-          <w:p>
-            <w:pPr>
-              <w:spacing w:after="40"/>
-            </w:pPr>
-            <w:r>
-              <w:rPr>
-                <w:rFonts w:ascii="Space Mono" w:hAnsi="Space Mono"/>
-                <w:b w:val="0"/>
-                <w:i w:val="0"/>
-                <w:color w:val="211B14"/>
-                <w:sz w:val="14"/>
-              </w:rPr>
-              <w:t>Next.js · Firebase · Leaflet · Privacy-first</w:t>
-            </w:r>
-          </w:p>
-          <w:p>
-            <w:pPr>
-              <w:tabs>
-                <w:tab w:pos="6480" w:val="right"/>
-              </w:tabs>
-              <w:spacing w:before="80"/>
-            </w:pPr>
-            <w:r>
-              <w:rPr>
-                <w:rFonts w:ascii="Fraunces" w:hAnsi="Fraunces"/>
-                <w:b/>
-                <w:i w:val="0"/>
-                <w:color w:val="211B14"/>
-                <w:sz w:val="22"/>
-              </w:rPr>
-              <w:t>ITIT — IT Inventory Tracker</w:t>
-            </w:r>
-            <w:r>
-              <w:rPr>
-                <w:rFonts w:ascii="Space Mono" w:hAnsi="Space Mono"/>
-                <w:b w:val="0"/>
-                <w:i w:val="0"/>
-                <w:color w:val="5A4F41"/>
-                <w:sz w:val="15"/>
-              </w:rPr>
-              <w:tab/>
-              <w:t>2025</w:t>
-            </w:r>
-          </w:p>
-          <w:p>
-            <w:pPr>
-              <w:spacing w:after="0" w:line="269" w:lineRule="auto"/>
-            </w:pPr>
-            <w:r>
-              <w:rPr>
-                <w:rFonts w:ascii="Schibsted Grotesk" w:hAnsi="Schibsted Grotesk"/>
-                <w:b w:val="0"/>
-                <w:i w:val="0"/>
-                <w:color w:val="5A4F41"/>
-                <w:sz w:val="17"/>
-              </w:rPr>
-              <w:t>Senior capstone with a four-person Scrum team: a physical IoT tracker paired with a web app for deployments, locations, and items — cheaper than enterprise systems, less error-prone than spreadsheets.</w:t>
-            </w:r>
-          </w:p>
-          <w:p>
-            <w:pPr>
-              <w:spacing w:after="40"/>
-            </w:pPr>
-            <w:r>
-              <w:rPr>
-                <w:rFonts w:ascii="Space Mono" w:hAnsi="Space Mono"/>
-                <w:b w:val="0"/>
-                <w:i w:val="0"/>
-                <w:color w:val="211B14"/>
-                <w:sz w:val="14"/>
-              </w:rPr>
-              <w:t>JavaScript · PHP · MySQL · IoT</w:t>
-            </w:r>
-          </w:p>
-          <w:p>
-            <w:pPr>
-              <w:tabs>
-                <w:tab w:pos="6480" w:val="right"/>
-              </w:tabs>
-              <w:spacing w:before="80"/>
-            </w:pPr>
-            <w:r>
-              <w:rPr>
-                <w:rFonts w:ascii="Fraunces" w:hAnsi="Fraunces"/>
-                <w:b/>
-                <w:i w:val="0"/>
-                <w:color w:val="211B14"/>
-                <w:sz w:val="22"/>
-              </w:rPr>
-              <w:t>Corne 42 Split Wireless Keyboard</w:t>
-            </w:r>
-            <w:r>
-              <w:rPr>
-                <w:rFonts w:ascii="Space Mono" w:hAnsi="Space Mono"/>
-                <w:b w:val="0"/>
-                <w:i w:val="0"/>
-                <w:color w:val="5A4F41"/>
-                <w:sz w:val="15"/>
-              </w:rPr>
-              <w:tab/>
-              <w:t>2024</w:t>
-            </w:r>
-          </w:p>
-          <w:p>
-            <w:pPr>
-              <w:spacing w:after="0" w:line="269" w:lineRule="auto"/>
-            </w:pPr>
-            <w:r>
-              <w:rPr>
-                <w:rFonts w:ascii="Schibsted Grotesk" w:hAnsi="Schibsted Grotesk"/>
-                <w:b w:val="0"/>
-                <w:i w:val="0"/>
-                <w:color w:val="5A4F41"/>
-                <w:sz w:val="17"/>
-              </w:rPr>
-              <w:t>A hand-built low-profile 42-key split keyboard on custom ZMK firmware — Bluetooth profiles, per-half OLED screens, a hotswap controller, and magnetic USB-C ports.</w:t>
-            </w:r>
-          </w:p>
-          <w:p>
-            <w:pPr>
-              <w:spacing w:after="40"/>
-            </w:pPr>
-            <w:r>
-              <w:rPr>
-                <w:rFonts w:ascii="Space Mono" w:hAnsi="Space Mono"/>
-                <w:b w:val="0"/>
-                <w:i w:val="0"/>
-                <w:color w:val="211B14"/>
-                <w:sz w:val="14"/>
-              </w:rPr>
-              <w:t>ZMK · Firmware · Hardware</w:t>
-            </w:r>
-          </w:p>
-          <w:p>
-            <w:pPr>
-              <w:tabs>
-                <w:tab w:pos="6480" w:val="right"/>
-              </w:tabs>
-              <w:spacing w:before="80"/>
-            </w:pPr>
-            <w:r>
-              <w:rPr>
-                <w:rFonts w:ascii="Fraunces" w:hAnsi="Fraunces"/>
-                <w:b/>
-                <w:i w:val="0"/>
-                <w:color w:val="211B14"/>
-                <w:sz w:val="22"/>
-              </w:rPr>
-              <w:t>Richard Blenz Nature Preserve</w:t>
-            </w:r>
-            <w:r>
-              <w:rPr>
-                <w:rFonts w:ascii="Space Mono" w:hAnsi="Space Mono"/>
-                <w:b w:val="0"/>
-                <w:i w:val="0"/>
-                <w:color w:val="5A4F41"/>
-                <w:sz w:val="15"/>
-              </w:rPr>
-              <w:tab/>
-              <w:t>2025</w:t>
-            </w:r>
-          </w:p>
-          <w:p>
-            <w:pPr>
-              <w:spacing w:after="0" w:line="269" w:lineRule="auto"/>
-            </w:pPr>
-            <w:r>
-              <w:rPr>
-                <w:rFonts w:ascii="Schibsted Grotesk" w:hAnsi="Schibsted Grotesk"/>
-                <w:b w:val="0"/>
-                <w:i w:val="0"/>
-                <w:color w:val="5A4F41"/>
-                <w:sz w:val="17"/>
-              </w:rPr>
-              <w:t>Responsive redesign of the NSS Buckner Cave preserve site (I360 Web Design final) — hand-coded HTML/CSS/JS with an animated nav, photo slideshow, and accordion geology &amp; biology sections around on-site cave photography.</w:t>
-            </w:r>
-          </w:p>
-          <w:p>
-            <w:pPr>
-              <w:spacing w:after="40"/>
-            </w:pPr>
-            <w:r>
-              <w:rPr>
-                <w:rFonts w:ascii="Space Mono" w:hAnsi="Space Mono"/>
-                <w:b w:val="0"/>
-                <w:i w:val="0"/>
-                <w:color w:val="211B14"/>
-                <w:sz w:val="14"/>
-              </w:rPr>
-              <w:t>HTML · CSS · JavaScript · Responsive</w:t>
-            </w:r>
-          </w:p>
         </w:tc>
         <w:tc>
           <w:tcPr>
@@ -1217,109 +956,6 @@
                 <w:color w:val="211B14"/>
                 <w:sz w:val="18"/>
               </w:rPr>
-              <w:t>CLUBS</w:t>
-            </w:r>
-          </w:p>
-          <w:p>
-            <w:pPr>
-              <w:spacing w:after="30"/>
-              <w:ind w:left="230" w:hanging="230"/>
-            </w:pPr>
-            <w:r>
-              <w:rPr>
-                <w:rFonts w:ascii="Schibsted Grotesk" w:hAnsi="Schibsted Grotesk"/>
-                <w:b w:val="0"/>
-                <w:i w:val="0"/>
-                <w:color w:val="D8539B"/>
-                <w:sz w:val="14"/>
-              </w:rPr>
-              <w:t xml:space="preserve">◆  </w:t>
-            </w:r>
-            <w:r>
-              <w:rPr>
-                <w:rFonts w:ascii="Schibsted Grotesk" w:hAnsi="Schibsted Grotesk"/>
-                <w:b w:val="0"/>
-                <w:i w:val="0"/>
-                <w:color w:val="5A4F41"/>
-                <w:sz w:val="18"/>
-              </w:rPr>
-              <w:t>Bloomington Indiana Grotto</w:t>
-            </w:r>
-          </w:p>
-          <w:p>
-            <w:pPr>
-              <w:spacing w:after="30"/>
-              <w:ind w:left="230" w:hanging="230"/>
-            </w:pPr>
-            <w:r>
-              <w:rPr>
-                <w:rFonts w:ascii="Schibsted Grotesk" w:hAnsi="Schibsted Grotesk"/>
-                <w:b w:val="0"/>
-                <w:i w:val="0"/>
-                <w:color w:val="D8539B"/>
-                <w:sz w:val="14"/>
-              </w:rPr>
-              <w:t xml:space="preserve">◆  </w:t>
-            </w:r>
-            <w:r>
-              <w:rPr>
-                <w:rFonts w:ascii="Schibsted Grotesk" w:hAnsi="Schibsted Grotesk"/>
-                <w:b w:val="0"/>
-                <w:i w:val="0"/>
-                <w:color w:val="5A4F41"/>
-                <w:sz w:val="18"/>
-              </w:rPr>
-              <w:t>Mechanical Keyboard Club</w:t>
-            </w:r>
-          </w:p>
-          <w:p>
-            <w:pPr>
-              <w:spacing w:after="30"/>
-              <w:ind w:left="230" w:hanging="230"/>
-            </w:pPr>
-            <w:r>
-              <w:rPr>
-                <w:rFonts w:ascii="Schibsted Grotesk" w:hAnsi="Schibsted Grotesk"/>
-                <w:b w:val="0"/>
-                <w:i w:val="0"/>
-                <w:color w:val="D8539B"/>
-                <w:sz w:val="14"/>
-              </w:rPr>
-              <w:t xml:space="preserve">◆  </w:t>
-            </w:r>
-            <w:r>
-              <w:rPr>
-                <w:rFonts w:ascii="Schibsted Grotesk" w:hAnsi="Schibsted Grotesk"/>
-                <w:b w:val="0"/>
-                <w:i w:val="0"/>
-                <w:color w:val="5A4F41"/>
-                <w:sz w:val="18"/>
-              </w:rPr>
-              <w:t>Views at IU</w:t>
-            </w:r>
-          </w:p>
-          <w:p>
-            <w:pPr>
-              <w:spacing w:before="180" w:after="60"/>
-            </w:pPr>
-            <w:r>
-              <w:rPr>
-                <w:rFonts w:ascii="Space Mono" w:hAnsi="Space Mono"/>
-                <w:b/>
-                <w:i w:val="0"/>
-                <w:color w:val="C08800"/>
-                <w:sz w:val="18"/>
-              </w:rPr>
-              <w:t xml:space="preserve">■ </w:t>
-            </w:r>
-            <w:r>
-              <w:rPr>
-                <w:rFonts w:ascii="Space Mono" w:hAnsi="Space Mono"/>
-                <w:b/>
-                <w:i w:val="0"/>
-                <w:color w:val="211B14"/>
-                <w:sz w:val="18"/>
-              </w:rPr>
               <w:t>OFF THE CLOCK</w:t>
             </w:r>
           </w:p>

</xml_diff>

<commit_message>
Résumé: clean single-column ATS .docx + editing guide
Per decision to make HTML/PDF the polished master: rebuilt the .docx as a
clean single-column, ATS-friendly doc (no tables/watermark/panels — those
confuse parsers and can't mirror the CSS design) with theme fonts embedded
and accent colors. Added a 'How to edit' guide (edit resume.html text →
print to PDF) to the README and an edit marker in the HTML.
</commit_message>
<xml_diff>
--- a/resume/Gabriel-Harlan-Resume.docx
+++ b/resume/Gabriel-Harlan-Resume.docx
@@ -12,7 +12,7 @@
           <w:b/>
           <w:i w:val="0"/>
           <w:color w:val="211B14"/>
-          <w:sz w:val="60"/>
+          <w:sz w:val="56"/>
         </w:rPr>
         <w:t>Gabriel Harlan</w:t>
       </w:r>
@@ -22,7 +22,7 @@
           <w:b/>
           <w:i w:val="0"/>
           <w:color w:val="F4502A"/>
-          <w:sz w:val="60"/>
+          <w:sz w:val="56"/>
         </w:rPr>
         <w:t>.</w:t>
       </w:r>
@@ -37,7 +37,7 @@
           <w:b w:val="0"/>
           <w:i w:val="0"/>
           <w:color w:val="5A4F41"/>
-          <w:sz w:val="17"/>
+          <w:sz w:val="18"/>
         </w:rPr>
         <w:t>Web &amp; UX Designer  ·  Informatics @ Indiana University</w:t>
       </w:r>
@@ -45,9 +45,9 @@
     <w:p>
       <w:pPr>
         <w:pBdr>
-          <w:bottom w:val="single" w:sz="18" w:space="4" w:color="211B14"/>
+          <w:bottom w:val="single" w:sz="18" w:space="3" w:color="211B14"/>
         </w:pBdr>
-        <w:spacing w:after="160"/>
+        <w:spacing w:after="40"/>
       </w:pPr>
       <w:r>
         <w:rPr>
@@ -55,972 +55,868 @@
           <w:b w:val="0"/>
           <w:i w:val="0"/>
           <w:color w:val="211B14"/>
+          <w:sz w:val="17"/>
+        </w:rPr>
+        <w:t>gbharlan@iu.edu  ·  gabrielharlan.is-a.dev  ·  linkedin.com/in/gbharlan  ·  github.com/gabeusgong  ·  Bloomington, IN</w:t>
+      </w:r>
+    </w:p>
+    <w:p>
+      <w:pPr>
+        <w:spacing w:before="220" w:after="80"/>
+        <w:pBdr>
+          <w:bottom w:val="single" w:sz="6" w:space="3" w:color="F4502A"/>
+        </w:pBdr>
+      </w:pPr>
+      <w:r>
+        <w:rPr>
+          <w:rFonts w:ascii="Space Mono" w:hAnsi="Space Mono"/>
+          <w:b/>
+          <w:i w:val="0"/>
+          <w:color w:val="F4502A"/>
+          <w:sz w:val="21"/>
+        </w:rPr>
+        <w:t>EDUCATION</w:t>
+      </w:r>
+    </w:p>
+    <w:p>
+      <w:pPr>
+        <w:tabs>
+          <w:tab w:pos="10224" w:val="right"/>
+        </w:tabs>
+        <w:spacing w:before="100"/>
+      </w:pPr>
+      <w:r>
+        <w:rPr>
+          <w:rFonts w:ascii="Fraunces" w:hAnsi="Fraunces"/>
+          <w:b/>
+          <w:i w:val="0"/>
+          <w:color w:val="211B14"/>
+          <w:sz w:val="24"/>
+        </w:rPr>
+        <w:t>Indiana University</w:t>
+      </w:r>
+      <w:r>
+        <w:rPr>
+          <w:rFonts w:ascii="Space Mono" w:hAnsi="Space Mono"/>
+          <w:b w:val="0"/>
+          <w:i w:val="0"/>
+          <w:color w:val="5A4F41"/>
           <w:sz w:val="16"/>
         </w:rPr>
-        <w:t>gbharlan@iu.edu   ·   gabrielharlan.is-a.dev   ·   linkedin.com/in/gbharlan   ·   github.com/gabeusgong   ·   Bloomington, IN</w:t>
+        <w:tab/>
+        <w:t>Aug 2022 – Dec 2026</w:t>
       </w:r>
     </w:p>
-    <w:tbl>
-      <w:tblPr>
-        <w:tblW w:type="auto" w:w="0"/>
-        <w:jc w:val="left"/>
-        <w:tblLook w:firstColumn="1" w:firstRow="1" w:lastColumn="0" w:lastRow="0" w:noHBand="0" w:noVBand="1" w:val="04A0"/>
-        <w:tblBorders>
-          <w:top w:val="none"/>
-          <w:left w:val="none"/>
-          <w:bottom w:val="none"/>
-          <w:right w:val="none"/>
-          <w:insideH w:val="none"/>
-          <w:insideV w:val="none"/>
-        </w:tblBorders>
-      </w:tblPr>
-      <w:tblGrid>
-        <w:gridCol w:w="5256"/>
-        <w:gridCol w:w="5256"/>
-      </w:tblGrid>
-      <w:tr>
-        <w:tc>
-          <w:tcPr>
-            <w:tcW w:type="dxa" w:w="6552"/>
-            <w:tcMar>
-              <w:top w:w="0" w:type="dxa"/>
-              <w:start w:w="0" w:type="dxa"/>
-              <w:bottom w:w="0" w:type="dxa"/>
-              <w:end w:w="170" w:type="dxa"/>
-            </w:tcMar>
-          </w:tcPr>
-          <w:p>
-            <w:pPr>
-              <w:spacing w:before="180" w:after="60"/>
-            </w:pPr>
-            <w:r>
-              <w:rPr>
-                <w:rFonts w:ascii="Space Mono" w:hAnsi="Space Mono"/>
-                <w:b/>
-                <w:i w:val="0"/>
-                <w:color w:val="F4502A"/>
-                <w:sz w:val="18"/>
-              </w:rPr>
-              <w:t xml:space="preserve">■ </w:t>
-            </w:r>
-            <w:r>
-              <w:rPr>
-                <w:rFonts w:ascii="Space Mono" w:hAnsi="Space Mono"/>
-                <w:b/>
-                <w:i w:val="0"/>
-                <w:color w:val="211B14"/>
-                <w:sz w:val="18"/>
-              </w:rPr>
-              <w:t>EDUCATION</w:t>
-            </w:r>
-          </w:p>
-          <w:p>
-            <w:pPr>
-              <w:tabs>
-                <w:tab w:pos="6480" w:val="right"/>
-              </w:tabs>
-              <w:spacing w:before="80"/>
-            </w:pPr>
-            <w:r>
-              <w:rPr>
-                <w:rFonts w:ascii="Fraunces" w:hAnsi="Fraunces"/>
-                <w:b/>
-                <w:i w:val="0"/>
-                <w:color w:val="211B14"/>
-                <w:sz w:val="22"/>
-              </w:rPr>
-              <w:t>Indiana University</w:t>
-            </w:r>
-            <w:r>
-              <w:rPr>
-                <w:rFonts w:ascii="Space Mono" w:hAnsi="Space Mono"/>
-                <w:b w:val="0"/>
-                <w:i w:val="0"/>
-                <w:color w:val="5A4F41"/>
-                <w:sz w:val="15"/>
-              </w:rPr>
-              <w:tab/>
-              <w:t>Aug 2022 – Dec 2026</w:t>
-            </w:r>
-          </w:p>
-          <w:p>
-            <w:pPr>
-              <w:spacing w:after="0"/>
-            </w:pPr>
-            <w:r>
-              <w:rPr>
-                <w:rFonts w:ascii="Schibsted Grotesk" w:hAnsi="Schibsted Grotesk"/>
-                <w:b w:val="0"/>
-                <w:i/>
-                <w:color w:val="5A4F41"/>
-                <w:sz w:val="18"/>
-              </w:rPr>
-              <w:t>B.S. in Informatics — Minors in Human-Centered Computing &amp; Web Design</w:t>
-            </w:r>
-          </w:p>
-          <w:p>
-            <w:pPr>
-              <w:spacing w:after="0"/>
-            </w:pPr>
-            <w:r>
-              <w:rPr>
-                <w:rFonts w:ascii="Space Mono" w:hAnsi="Space Mono"/>
-                <w:b w:val="0"/>
-                <w:i w:val="0"/>
-                <w:color w:val="5A4F41"/>
-                <w:sz w:val="15"/>
-              </w:rPr>
-              <w:t>Bloomington, Indiana</w:t>
-            </w:r>
-          </w:p>
-          <w:p>
-            <w:pPr>
-              <w:spacing w:before="40"/>
-            </w:pPr>
-            <w:r>
-              <w:rPr>
-                <w:rFonts w:ascii="Space Mono" w:hAnsi="Space Mono"/>
-                <w:b/>
-                <w:i w:val="0"/>
-                <w:color w:val="211B14"/>
-                <w:sz w:val="15"/>
-              </w:rPr>
-              <w:t xml:space="preserve">Coursework  </w:t>
-            </w:r>
-            <w:r>
-              <w:rPr>
-                <w:rFonts w:ascii="Schibsted Grotesk" w:hAnsi="Schibsted Grotesk"/>
-                <w:b w:val="0"/>
-                <w:i w:val="0"/>
-                <w:color w:val="5A4F41"/>
-                <w:sz w:val="17"/>
-              </w:rPr>
-              <w:t>Human-Computer Interaction &amp; Design · Methods for Human-Centered Computing · Design &amp; Development of an Information System · Web Design · JavaScript · Intro to Cybersecurity · Computer &amp; Information Ethics</w:t>
-            </w:r>
-          </w:p>
-          <w:p>
-            <w:pPr>
-              <w:tabs>
-                <w:tab w:pos="6480" w:val="right"/>
-              </w:tabs>
-              <w:spacing w:before="80"/>
-            </w:pPr>
-            <w:r>
-              <w:rPr>
-                <w:rFonts w:ascii="Fraunces" w:hAnsi="Fraunces"/>
-                <w:b/>
-                <w:i w:val="0"/>
-                <w:color w:val="211B14"/>
-                <w:sz w:val="22"/>
-              </w:rPr>
-              <w:t>Allegan County Area Technical &amp; Education Center</w:t>
-            </w:r>
-            <w:r>
-              <w:rPr>
-                <w:rFonts w:ascii="Space Mono" w:hAnsi="Space Mono"/>
-                <w:b w:val="0"/>
-                <w:i w:val="0"/>
-                <w:color w:val="5A4F41"/>
-                <w:sz w:val="15"/>
-              </w:rPr>
-              <w:tab/>
-              <w:t>Sep 2021 – May 2022</w:t>
-            </w:r>
-          </w:p>
-          <w:p>
-            <w:pPr>
-              <w:spacing w:after="0"/>
-            </w:pPr>
-            <w:r>
-              <w:rPr>
-                <w:rFonts w:ascii="Schibsted Grotesk" w:hAnsi="Schibsted Grotesk"/>
-                <w:b w:val="0"/>
-                <w:i/>
-                <w:color w:val="5A4F41"/>
-                <w:sz w:val="18"/>
-              </w:rPr>
-              <w:t>Computer Information Systems</w:t>
-            </w:r>
-          </w:p>
-          <w:p>
-            <w:pPr>
-              <w:spacing w:after="0"/>
-            </w:pPr>
-            <w:r>
-              <w:rPr>
-                <w:rFonts w:ascii="Space Mono" w:hAnsi="Space Mono"/>
-                <w:b w:val="0"/>
-                <w:i w:val="0"/>
-                <w:color w:val="5A4F41"/>
-                <w:sz w:val="15"/>
-              </w:rPr>
-              <w:t>Allegan, Michigan</w:t>
-            </w:r>
-          </w:p>
-          <w:p>
-            <w:pPr>
-              <w:spacing w:after="30"/>
-              <w:ind w:left="230" w:hanging="230"/>
-            </w:pPr>
-            <w:r>
-              <w:rPr>
-                <w:rFonts w:ascii="Schibsted Grotesk" w:hAnsi="Schibsted Grotesk"/>
-                <w:b w:val="0"/>
-                <w:i w:val="0"/>
-                <w:color w:val="F4502A"/>
-                <w:sz w:val="14"/>
-              </w:rPr>
-              <w:t xml:space="preserve">◆  </w:t>
-            </w:r>
-            <w:r>
-              <w:rPr>
-                <w:rFonts w:ascii="Schibsted Grotesk" w:hAnsi="Schibsted Grotesk"/>
-                <w:b w:val="0"/>
-                <w:i w:val="0"/>
-                <w:color w:val="5A4F41"/>
-                <w:sz w:val="18"/>
-              </w:rPr>
-              <w:t>Installed, configured, and administered network infrastructure end-to-end, and built/modified computer hardware, software, and operating systems to spec.</w:t>
-            </w:r>
-          </w:p>
-          <w:p>
-            <w:pPr>
-              <w:spacing w:before="180" w:after="60"/>
-            </w:pPr>
-            <w:r>
-              <w:rPr>
-                <w:rFonts w:ascii="Space Mono" w:hAnsi="Space Mono"/>
-                <w:b/>
-                <w:i w:val="0"/>
-                <w:color w:val="2D4DF5"/>
-                <w:sz w:val="18"/>
-              </w:rPr>
-              <w:t xml:space="preserve">■ </w:t>
-            </w:r>
-            <w:r>
-              <w:rPr>
-                <w:rFonts w:ascii="Space Mono" w:hAnsi="Space Mono"/>
-                <w:b/>
-                <w:i w:val="0"/>
-                <w:color w:val="211B14"/>
-                <w:sz w:val="18"/>
-              </w:rPr>
-              <w:t>EXPERIENCE</w:t>
-            </w:r>
-          </w:p>
-          <w:p>
-            <w:pPr>
-              <w:spacing w:after="40"/>
-            </w:pPr>
-            <w:r>
-              <w:rPr>
-                <w:rFonts w:ascii="Space Mono" w:hAnsi="Space Mono"/>
-                <w:b w:val="0"/>
-                <w:i w:val="0"/>
-                <w:color w:val="5A4F41"/>
-                <w:sz w:val="15"/>
-              </w:rPr>
-              <w:t>Tire Rack · South Bend, Indiana (hybrid)</w:t>
-            </w:r>
-          </w:p>
-          <w:p>
-            <w:pPr>
-              <w:tabs>
-                <w:tab w:pos="6480" w:val="right"/>
-              </w:tabs>
-              <w:spacing w:before="80"/>
-            </w:pPr>
-            <w:r>
-              <w:rPr>
-                <w:rFonts w:ascii="Fraunces" w:hAnsi="Fraunces"/>
-                <w:b/>
-                <w:i w:val="0"/>
-                <w:color w:val="211B14"/>
-                <w:sz w:val="22"/>
-              </w:rPr>
-              <w:t>Innovation &amp; AI Intern</w:t>
-            </w:r>
-            <w:r>
-              <w:rPr>
-                <w:rFonts w:ascii="Space Mono" w:hAnsi="Space Mono"/>
-                <w:b w:val="0"/>
-                <w:i w:val="0"/>
-                <w:color w:val="5A4F41"/>
-                <w:sz w:val="15"/>
-              </w:rPr>
-              <w:tab/>
-              <w:t>Jun 2026 – Present</w:t>
-            </w:r>
-          </w:p>
-          <w:p>
-            <w:pPr>
-              <w:spacing w:after="30"/>
-              <w:ind w:left="230" w:hanging="230"/>
-            </w:pPr>
-            <w:r>
-              <w:rPr>
-                <w:rFonts w:ascii="Schibsted Grotesk" w:hAnsi="Schibsted Grotesk"/>
-                <w:b w:val="0"/>
-                <w:i w:val="0"/>
-                <w:color w:val="2D4DF5"/>
-                <w:sz w:val="14"/>
-              </w:rPr>
-              <w:t xml:space="preserve">◆  </w:t>
-            </w:r>
-            <w:r>
-              <w:rPr>
-                <w:rFonts w:ascii="Schibsted Grotesk" w:hAnsi="Schibsted Grotesk"/>
-                <w:b w:val="0"/>
-                <w:i w:val="0"/>
-                <w:color w:val="5A4F41"/>
-                <w:sz w:val="18"/>
-              </w:rPr>
-              <w:t>Designed, built, and deployed a production SMS gateway (Python / FastAPI on Cloud Run) that lets customers text Tire Rack's TRACI AI agent — inbound webhook → async worker → agent call → replies rendered into SMS via Twilio; backed by Redis/SQS, 42 tests, and keyless CI/CD.</w:t>
-            </w:r>
-          </w:p>
-          <w:p>
-            <w:pPr>
-              <w:spacing w:after="30"/>
-              <w:ind w:left="230" w:hanging="230"/>
-            </w:pPr>
-            <w:r>
-              <w:rPr>
-                <w:rFonts w:ascii="Schibsted Grotesk" w:hAnsi="Schibsted Grotesk"/>
-                <w:b w:val="0"/>
-                <w:i w:val="0"/>
-                <w:color w:val="2D4DF5"/>
-                <w:sz w:val="14"/>
-              </w:rPr>
-              <w:t xml:space="preserve">◆  </w:t>
-            </w:r>
-            <w:r>
-              <w:rPr>
-                <w:rFonts w:ascii="Schibsted Grotesk" w:hAnsi="Schibsted Grotesk"/>
-                <w:b w:val="0"/>
-                <w:i w:val="0"/>
-                <w:color w:val="5A4F41"/>
-                <w:sz w:val="18"/>
-              </w:rPr>
-              <w:t>Cracked its core blocker — the web-only vehicle picker can't render over SMS — with a numbered year/make/model drill-down over the site's YMMV APIs that auto-supplies the factory tire size.</w:t>
-            </w:r>
-          </w:p>
-          <w:p>
-            <w:pPr>
-              <w:spacing w:after="30"/>
-              <w:ind w:left="230" w:hanging="230"/>
-            </w:pPr>
-            <w:r>
-              <w:rPr>
-                <w:rFonts w:ascii="Schibsted Grotesk" w:hAnsi="Schibsted Grotesk"/>
-                <w:b w:val="0"/>
-                <w:i w:val="0"/>
-                <w:color w:val="2D4DF5"/>
-                <w:sz w:val="14"/>
-              </w:rPr>
-              <w:t xml:space="preserve">◆  </w:t>
-            </w:r>
-            <w:r>
-              <w:rPr>
-                <w:rFonts w:ascii="Schibsted Grotesk" w:hAnsi="Schibsted Grotesk"/>
-                <w:b w:val="0"/>
-                <w:i w:val="0"/>
-                <w:color w:val="5A4F41"/>
-                <w:sz w:val="18"/>
-              </w:rPr>
-              <w:t>Built Karst, a Next.js + Firebase caving field-guide app (web + Android) with a privacy-first map — shipped fast with AI-assisted development.</w:t>
-            </w:r>
-          </w:p>
-          <w:p>
-            <w:pPr>
-              <w:spacing w:before="80" w:after="40"/>
-            </w:pPr>
-            <w:r>
-              <w:rPr>
-                <w:rFonts w:ascii="Space Mono" w:hAnsi="Space Mono"/>
-                <w:b w:val="0"/>
-                <w:i w:val="0"/>
-                <w:color w:val="5A4F41"/>
-                <w:sz w:val="15"/>
-              </w:rPr>
-              <w:t>University Information Technology Services · Indiana University</w:t>
-            </w:r>
-          </w:p>
-          <w:p>
-            <w:pPr>
-              <w:tabs>
-                <w:tab w:pos="6480" w:val="right"/>
-              </w:tabs>
-              <w:spacing w:before="80"/>
-            </w:pPr>
-            <w:r>
-              <w:rPr>
-                <w:rFonts w:ascii="Fraunces" w:hAnsi="Fraunces"/>
-                <w:b/>
-                <w:i w:val="0"/>
-                <w:color w:val="211B14"/>
-                <w:sz w:val="22"/>
-              </w:rPr>
-              <w:t>SCIPS Consultant Supervisor</w:t>
-            </w:r>
-            <w:r>
-              <w:rPr>
-                <w:rFonts w:ascii="Space Mono" w:hAnsi="Space Mono"/>
-                <w:b w:val="0"/>
-                <w:i w:val="0"/>
-                <w:color w:val="5A4F41"/>
-                <w:sz w:val="15"/>
-              </w:rPr>
-              <w:tab/>
-              <w:t>Aug 2024 – Feb 2026</w:t>
-            </w:r>
-          </w:p>
-          <w:p>
-            <w:pPr>
-              <w:spacing w:after="30"/>
-              <w:ind w:left="230" w:hanging="230"/>
-            </w:pPr>
-            <w:r>
-              <w:rPr>
-                <w:rFonts w:ascii="Schibsted Grotesk" w:hAnsi="Schibsted Grotesk"/>
-                <w:b w:val="0"/>
-                <w:i w:val="0"/>
-                <w:color w:val="2D4DF5"/>
-                <w:sz w:val="14"/>
-              </w:rPr>
-              <w:t xml:space="preserve">◆  </w:t>
-            </w:r>
-            <w:r>
-              <w:rPr>
-                <w:rFonts w:ascii="Schibsted Grotesk" w:hAnsi="Schibsted Grotesk"/>
-                <w:b w:val="0"/>
-                <w:i w:val="0"/>
-                <w:color w:val="5A4F41"/>
-                <w:sz w:val="18"/>
-              </w:rPr>
-              <w:t>Led the Tech Team and walk-in Support Center, coaching consultants through complex technical and customer issues.</w:t>
-            </w:r>
-          </w:p>
-          <w:p>
-            <w:pPr>
-              <w:spacing w:after="30"/>
-              <w:ind w:left="230" w:hanging="230"/>
-            </w:pPr>
-            <w:r>
-              <w:rPr>
-                <w:rFonts w:ascii="Schibsted Grotesk" w:hAnsi="Schibsted Grotesk"/>
-                <w:b w:val="0"/>
-                <w:i w:val="0"/>
-                <w:color w:val="2D4DF5"/>
-                <w:sz w:val="14"/>
-              </w:rPr>
-              <w:t xml:space="preserve">◆  </w:t>
-            </w:r>
-            <w:r>
-              <w:rPr>
-                <w:rFonts w:ascii="Schibsted Grotesk" w:hAnsi="Schibsted Grotesk"/>
-                <w:b w:val="0"/>
-                <w:i w:val="0"/>
-                <w:color w:val="5A4F41"/>
-                <w:sz w:val="18"/>
-              </w:rPr>
-              <w:t>Drove campus-wide support for labs, printers, and classroom tech — from preemptive checks to urgent in-person requests.</w:t>
-            </w:r>
-          </w:p>
-          <w:p>
-            <w:pPr>
-              <w:tabs>
-                <w:tab w:pos="6480" w:val="right"/>
-              </w:tabs>
-              <w:spacing w:before="80"/>
-            </w:pPr>
-            <w:r>
-              <w:rPr>
-                <w:rFonts w:ascii="Fraunces" w:hAnsi="Fraunces"/>
-                <w:b/>
-                <w:i w:val="0"/>
-                <w:color w:val="211B14"/>
-                <w:sz w:val="22"/>
-              </w:rPr>
-              <w:t>TCC Tech Team</w:t>
-            </w:r>
-            <w:r>
-              <w:rPr>
-                <w:rFonts w:ascii="Space Mono" w:hAnsi="Space Mono"/>
-                <w:b w:val="0"/>
-                <w:i w:val="0"/>
-                <w:color w:val="5A4F41"/>
-                <w:sz w:val="15"/>
-              </w:rPr>
-              <w:tab/>
-              <w:t>Nov 2023 – May 2024</w:t>
-            </w:r>
-          </w:p>
-          <w:p>
-            <w:pPr>
-              <w:spacing w:after="30"/>
-              <w:ind w:left="230" w:hanging="230"/>
-            </w:pPr>
-            <w:r>
-              <w:rPr>
-                <w:rFonts w:ascii="Schibsted Grotesk" w:hAnsi="Schibsted Grotesk"/>
-                <w:b w:val="0"/>
-                <w:i w:val="0"/>
-                <w:color w:val="2D4DF5"/>
-                <w:sz w:val="14"/>
-              </w:rPr>
-              <w:t xml:space="preserve">◆  </w:t>
-            </w:r>
-            <w:r>
-              <w:rPr>
-                <w:rFonts w:ascii="Schibsted Grotesk" w:hAnsi="Schibsted Grotesk"/>
-                <w:b w:val="0"/>
-                <w:i w:val="0"/>
-                <w:color w:val="5A4F41"/>
-                <w:sz w:val="18"/>
-              </w:rPr>
-              <w:t>Resolved client tickets across virtual, in-office, and in-room appointments, and set up wired/wireless connectivity for campus residents.</w:t>
-            </w:r>
-          </w:p>
-          <w:p>
-            <w:pPr>
-              <w:tabs>
-                <w:tab w:pos="6480" w:val="right"/>
-              </w:tabs>
-              <w:spacing w:before="80"/>
-            </w:pPr>
-            <w:r>
-              <w:rPr>
-                <w:rFonts w:ascii="Fraunces" w:hAnsi="Fraunces"/>
-                <w:b/>
-                <w:i w:val="0"/>
-                <w:color w:val="211B14"/>
-                <w:sz w:val="22"/>
-              </w:rPr>
-              <w:t>Technology Center Consultant</w:t>
-            </w:r>
-            <w:r>
-              <w:rPr>
-                <w:rFonts w:ascii="Space Mono" w:hAnsi="Space Mono"/>
-                <w:b w:val="0"/>
-                <w:i w:val="0"/>
-                <w:color w:val="5A4F41"/>
-                <w:sz w:val="15"/>
-              </w:rPr>
-              <w:tab/>
-              <w:t>Sep 2023 – Nov 2023</w:t>
-            </w:r>
-          </w:p>
-          <w:p>
-            <w:pPr>
-              <w:spacing w:after="30"/>
-              <w:ind w:left="230" w:hanging="230"/>
-            </w:pPr>
-            <w:r>
-              <w:rPr>
-                <w:rFonts w:ascii="Schibsted Grotesk" w:hAnsi="Schibsted Grotesk"/>
-                <w:b w:val="0"/>
-                <w:i w:val="0"/>
-                <w:color w:val="2D4DF5"/>
-                <w:sz w:val="14"/>
-              </w:rPr>
-              <w:t xml:space="preserve">◆  </w:t>
-            </w:r>
-            <w:r>
-              <w:rPr>
-                <w:rFonts w:ascii="Schibsted Grotesk" w:hAnsi="Schibsted Grotesk"/>
-                <w:b w:val="0"/>
-                <w:i w:val="0"/>
-                <w:color w:val="5A4F41"/>
-                <w:sz w:val="18"/>
-              </w:rPr>
-              <w:t>Troubleshot software and printer issues for walk-in clients and kept lab equipment stocked and organized.</w:t>
-            </w:r>
-          </w:p>
-          <w:p>
-            <w:pPr>
-              <w:spacing w:after="30"/>
-              <w:ind w:left="230" w:hanging="230"/>
-            </w:pPr>
-            <w:r>
-              <w:rPr>
-                <w:rFonts w:ascii="Schibsted Grotesk" w:hAnsi="Schibsted Grotesk"/>
-                <w:b w:val="0"/>
-                <w:i w:val="0"/>
-                <w:color w:val="2D4DF5"/>
-                <w:sz w:val="14"/>
-              </w:rPr>
-              <w:t xml:space="preserve">◆  </w:t>
-            </w:r>
-            <w:r>
-              <w:rPr>
-                <w:rFonts w:ascii="Schibsted Grotesk" w:hAnsi="Schibsted Grotesk"/>
-                <w:b w:val="0"/>
-                <w:i w:val="0"/>
-                <w:color w:val="5A4F41"/>
-                <w:sz w:val="18"/>
-              </w:rPr>
-              <w:t>Logged and tracked issues in ticketing systems, producing customer and lab reports.</w:t>
-            </w:r>
-          </w:p>
-        </w:tc>
-        <w:tc>
-          <w:tcPr>
-            <w:tcW w:type="dxa" w:w="3960"/>
-            <w:shd w:val="clear" w:fill="EFE4CA"/>
-            <w:tcMar>
-              <w:top w:w="120" w:type="dxa"/>
-              <w:start w:w="170" w:type="dxa"/>
-              <w:bottom w:w="140" w:type="dxa"/>
-              <w:end w:w="140" w:type="dxa"/>
-            </w:tcMar>
-          </w:tcPr>
-          <w:p>
-            <w:pPr>
-              <w:spacing w:before="180" w:after="60"/>
-            </w:pPr>
-            <w:r>
-              <w:rPr>
-                <w:rFonts w:ascii="Space Mono" w:hAnsi="Space Mono"/>
-                <w:b/>
-                <w:i w:val="0"/>
-                <w:color w:val="2D4DF5"/>
-                <w:sz w:val="18"/>
-              </w:rPr>
-              <w:t xml:space="preserve">■ </w:t>
-            </w:r>
-            <w:r>
-              <w:rPr>
-                <w:rFonts w:ascii="Space Mono" w:hAnsi="Space Mono"/>
-                <w:b/>
-                <w:i w:val="0"/>
-                <w:color w:val="211B14"/>
-                <w:sz w:val="18"/>
-              </w:rPr>
-              <w:t>SKILLS</w:t>
-            </w:r>
-          </w:p>
-          <w:p>
-            <w:pPr>
-              <w:spacing w:before="60" w:after="0"/>
-            </w:pPr>
-            <w:r>
-              <w:rPr>
-                <w:rFonts w:ascii="Space Mono" w:hAnsi="Space Mono"/>
-                <w:b/>
-                <w:i w:val="0"/>
-                <w:color w:val="211B14"/>
-                <w:sz w:val="15"/>
-              </w:rPr>
-              <w:t>Languages</w:t>
-            </w:r>
-          </w:p>
-          <w:p>
-            <w:pPr>
-              <w:spacing w:after="0"/>
-            </w:pPr>
-            <w:r>
-              <w:rPr>
-                <w:rFonts w:ascii="Schibsted Grotesk" w:hAnsi="Schibsted Grotesk"/>
-                <w:b w:val="0"/>
-                <w:i w:val="0"/>
-                <w:color w:val="5A4F41"/>
-                <w:sz w:val="17"/>
-              </w:rPr>
-              <w:t>JavaScript, Python, PHP, MySQL</w:t>
-            </w:r>
-          </w:p>
-          <w:p>
-            <w:pPr>
-              <w:spacing w:before="60" w:after="0"/>
-            </w:pPr>
-            <w:r>
-              <w:rPr>
-                <w:rFonts w:ascii="Space Mono" w:hAnsi="Space Mono"/>
-                <w:b/>
-                <w:i w:val="0"/>
-                <w:color w:val="211B14"/>
-                <w:sz w:val="15"/>
-              </w:rPr>
-              <w:t>Web &amp; Frameworks</w:t>
-            </w:r>
-          </w:p>
-          <w:p>
-            <w:pPr>
-              <w:spacing w:after="0"/>
-            </w:pPr>
-            <w:r>
-              <w:rPr>
-                <w:rFonts w:ascii="Schibsted Grotesk" w:hAnsi="Schibsted Grotesk"/>
-                <w:b w:val="0"/>
-                <w:i w:val="0"/>
-                <w:color w:val="5A4F41"/>
-                <w:sz w:val="17"/>
-              </w:rPr>
-              <w:t>React / Next.js, HTML, CSS, Firebase, Git</w:t>
-            </w:r>
-          </w:p>
-          <w:p>
-            <w:pPr>
-              <w:spacing w:before="60" w:after="0"/>
-            </w:pPr>
-            <w:r>
-              <w:rPr>
-                <w:rFonts w:ascii="Space Mono" w:hAnsi="Space Mono"/>
-                <w:b/>
-                <w:i w:val="0"/>
-                <w:color w:val="211B14"/>
-                <w:sz w:val="15"/>
-              </w:rPr>
-              <w:t>Design</w:t>
-            </w:r>
-          </w:p>
-          <w:p>
-            <w:pPr>
-              <w:spacing w:after="0"/>
-            </w:pPr>
-            <w:r>
-              <w:rPr>
-                <w:rFonts w:ascii="Schibsted Grotesk" w:hAnsi="Schibsted Grotesk"/>
-                <w:b w:val="0"/>
-                <w:i w:val="0"/>
-                <w:color w:val="5A4F41"/>
-                <w:sz w:val="17"/>
-              </w:rPr>
-              <w:t>Figma, UX &amp; HCI Design, Web Design, Tableau</w:t>
-            </w:r>
-          </w:p>
-          <w:p>
-            <w:pPr>
-              <w:spacing w:before="60" w:after="0"/>
-            </w:pPr>
-            <w:r>
-              <w:rPr>
-                <w:rFonts w:ascii="Space Mono" w:hAnsi="Space Mono"/>
-                <w:b/>
-                <w:i w:val="0"/>
-                <w:color w:val="211B14"/>
-                <w:sz w:val="15"/>
-              </w:rPr>
-              <w:t>Operating Systems</w:t>
-            </w:r>
-          </w:p>
-          <w:p>
-            <w:pPr>
-              <w:spacing w:after="0"/>
-            </w:pPr>
-            <w:r>
-              <w:rPr>
-                <w:rFonts w:ascii="Schibsted Grotesk" w:hAnsi="Schibsted Grotesk"/>
-                <w:b w:val="0"/>
-                <w:i w:val="0"/>
-                <w:color w:val="5A4F41"/>
-                <w:sz w:val="17"/>
-              </w:rPr>
-              <w:t>Linux, macOS, Windows 10/11, Windows Server</w:t>
-            </w:r>
-          </w:p>
-          <w:p>
-            <w:pPr>
-              <w:spacing w:before="60" w:after="0"/>
-            </w:pPr>
-            <w:r>
-              <w:rPr>
-                <w:rFonts w:ascii="Space Mono" w:hAnsi="Space Mono"/>
-                <w:b/>
-                <w:i w:val="0"/>
-                <w:color w:val="211B14"/>
-                <w:sz w:val="15"/>
-              </w:rPr>
-              <w:t>Tools</w:t>
-            </w:r>
-          </w:p>
-          <w:p>
-            <w:pPr>
-              <w:spacing w:after="0"/>
-            </w:pPr>
-            <w:r>
-              <w:rPr>
-                <w:rFonts w:ascii="Schibsted Grotesk" w:hAnsi="Schibsted Grotesk"/>
-                <w:b w:val="0"/>
-                <w:i w:val="0"/>
-                <w:color w:val="5A4F41"/>
-                <w:sz w:val="17"/>
-              </w:rPr>
-              <w:t>Active Directory, Office365, VirtualBox, VMware, VS Code, WSL</w:t>
-            </w:r>
-          </w:p>
-          <w:p>
-            <w:pPr>
-              <w:spacing w:before="180" w:after="60"/>
-            </w:pPr>
-            <w:r>
-              <w:rPr>
-                <w:rFonts w:ascii="Space Mono" w:hAnsi="Space Mono"/>
-                <w:b/>
-                <w:i w:val="0"/>
-                <w:color w:val="82990A"/>
-                <w:sz w:val="18"/>
-              </w:rPr>
-              <w:t xml:space="preserve">■ </w:t>
-            </w:r>
-            <w:r>
-              <w:rPr>
-                <w:rFonts w:ascii="Space Mono" w:hAnsi="Space Mono"/>
-                <w:b/>
-                <w:i w:val="0"/>
-                <w:color w:val="211B14"/>
-                <w:sz w:val="18"/>
-              </w:rPr>
-              <w:t>CERTIFICATIONS</w:t>
-            </w:r>
-          </w:p>
-          <w:p>
-            <w:pPr>
-              <w:spacing w:after="30"/>
-              <w:ind w:left="230" w:hanging="230"/>
-            </w:pPr>
-            <w:r>
-              <w:rPr>
-                <w:rFonts w:ascii="Schibsted Grotesk" w:hAnsi="Schibsted Grotesk"/>
-                <w:b w:val="0"/>
-                <w:i w:val="0"/>
-                <w:color w:val="82990A"/>
-                <w:sz w:val="14"/>
-              </w:rPr>
-              <w:t xml:space="preserve">◆  </w:t>
-            </w:r>
-            <w:r>
-              <w:rPr>
-                <w:rFonts w:ascii="Schibsted Grotesk" w:hAnsi="Schibsted Grotesk"/>
-                <w:b w:val="0"/>
-                <w:i w:val="0"/>
-                <w:color w:val="5A4F41"/>
-                <w:sz w:val="18"/>
-              </w:rPr>
-              <w:t>Certiport ITS — Computational Thinking, Cybersecurity, Device Configuration &amp; Management, Network Security &amp; Networking</w:t>
-            </w:r>
-          </w:p>
-          <w:p>
-            <w:pPr>
-              <w:spacing w:after="30"/>
-              <w:ind w:left="230" w:hanging="230"/>
-            </w:pPr>
-            <w:r>
-              <w:rPr>
-                <w:rFonts w:ascii="Schibsted Grotesk" w:hAnsi="Schibsted Grotesk"/>
-                <w:b w:val="0"/>
-                <w:i w:val="0"/>
-                <w:color w:val="82990A"/>
-                <w:sz w:val="14"/>
-              </w:rPr>
-              <w:t xml:space="preserve">◆  </w:t>
-            </w:r>
-            <w:r>
-              <w:rPr>
-                <w:rFonts w:ascii="Schibsted Grotesk" w:hAnsi="Schibsted Grotesk"/>
-                <w:b w:val="0"/>
-                <w:i w:val="0"/>
-                <w:color w:val="5A4F41"/>
-                <w:sz w:val="18"/>
-              </w:rPr>
-              <w:t>Cisco Certified Support Technician — Cybersecurity</w:t>
-            </w:r>
-          </w:p>
-          <w:p>
-            <w:pPr>
-              <w:spacing w:after="30"/>
-              <w:ind w:left="230" w:hanging="230"/>
-            </w:pPr>
-            <w:r>
-              <w:rPr>
-                <w:rFonts w:ascii="Schibsted Grotesk" w:hAnsi="Schibsted Grotesk"/>
-                <w:b w:val="0"/>
-                <w:i w:val="0"/>
-                <w:color w:val="82990A"/>
-                <w:sz w:val="14"/>
-              </w:rPr>
-              <w:t xml:space="preserve">◆  </w:t>
-            </w:r>
-            <w:r>
-              <w:rPr>
-                <w:rFonts w:ascii="Schibsted Grotesk" w:hAnsi="Schibsted Grotesk"/>
-                <w:b w:val="0"/>
-                <w:i w:val="0"/>
-                <w:color w:val="5A4F41"/>
-                <w:sz w:val="18"/>
-              </w:rPr>
-              <w:t>Cisco IT Essentials</w:t>
-            </w:r>
-          </w:p>
-          <w:p>
-            <w:pPr>
-              <w:spacing w:after="30"/>
-              <w:ind w:left="230" w:hanging="230"/>
-            </w:pPr>
-            <w:r>
-              <w:rPr>
-                <w:rFonts w:ascii="Schibsted Grotesk" w:hAnsi="Schibsted Grotesk"/>
-                <w:b w:val="0"/>
-                <w:i w:val="0"/>
-                <w:color w:val="82990A"/>
-                <w:sz w:val="14"/>
-              </w:rPr>
-              <w:t xml:space="preserve">◆  </w:t>
-            </w:r>
-            <w:r>
-              <w:rPr>
-                <w:rFonts w:ascii="Schibsted Grotesk" w:hAnsi="Schibsted Grotesk"/>
-                <w:b w:val="0"/>
-                <w:i w:val="0"/>
-                <w:color w:val="5A4F41"/>
-                <w:sz w:val="18"/>
-              </w:rPr>
-              <w:t>TestOut PC Pro</w:t>
-            </w:r>
-          </w:p>
-          <w:p>
-            <w:pPr>
-              <w:spacing w:before="180" w:after="60"/>
-            </w:pPr>
-            <w:r>
-              <w:rPr>
-                <w:rFonts w:ascii="Space Mono" w:hAnsi="Space Mono"/>
-                <w:b/>
-                <w:i w:val="0"/>
-                <w:color w:val="D8539B"/>
-                <w:sz w:val="18"/>
-              </w:rPr>
-              <w:t xml:space="preserve">■ </w:t>
-            </w:r>
-            <w:r>
-              <w:rPr>
-                <w:rFonts w:ascii="Space Mono" w:hAnsi="Space Mono"/>
-                <w:b/>
-                <w:i w:val="0"/>
-                <w:color w:val="211B14"/>
-                <w:sz w:val="18"/>
-              </w:rPr>
-              <w:t>OFF THE CLOCK</w:t>
-            </w:r>
-          </w:p>
-          <w:p>
-            <w:r>
-              <w:rPr>
-                <w:rFonts w:ascii="Schibsted Grotesk" w:hAnsi="Schibsted Grotesk"/>
-                <w:b w:val="0"/>
-                <w:i w:val="0"/>
-                <w:color w:val="5A4F41"/>
-                <w:sz w:val="17"/>
-              </w:rPr>
-              <w:t>Caving · Coffee · Gym · Hiking · PC building · Custom keyboards · Plants · Reading · Swimming</w:t>
-            </w:r>
-          </w:p>
-        </w:tc>
-      </w:tr>
-    </w:tbl>
+    <w:p>
+      <w:pPr>
+        <w:spacing w:after="0"/>
+      </w:pPr>
+      <w:r>
+        <w:rPr>
+          <w:rFonts w:ascii="Schibsted Grotesk" w:hAnsi="Schibsted Grotesk"/>
+          <w:b w:val="0"/>
+          <w:i/>
+          <w:color w:val="5A4F41"/>
+          <w:sz w:val="19"/>
+        </w:rPr>
+        <w:t>B.S. in Informatics — Minors in Human-Centered Computing &amp; Web Design</w:t>
+      </w:r>
+    </w:p>
+    <w:p>
+      <w:pPr>
+        <w:spacing w:after="0"/>
+      </w:pPr>
+      <w:r>
+        <w:rPr>
+          <w:rFonts w:ascii="Space Mono" w:hAnsi="Space Mono"/>
+          <w:b w:val="0"/>
+          <w:i w:val="0"/>
+          <w:color w:val="5A4F41"/>
+          <w:sz w:val="16"/>
+        </w:rPr>
+        <w:t>Bloomington, Indiana</w:t>
+      </w:r>
+    </w:p>
+    <w:p>
+      <w:pPr>
+        <w:spacing w:before="40" w:after="0"/>
+      </w:pPr>
+      <w:r>
+        <w:rPr>
+          <w:rFonts w:ascii="Space Mono" w:hAnsi="Space Mono"/>
+          <w:b/>
+          <w:i w:val="0"/>
+          <w:color w:val="211B14"/>
+          <w:sz w:val="17"/>
+        </w:rPr>
+        <w:t xml:space="preserve">Coursework:  </w:t>
+      </w:r>
+      <w:r>
+        <w:rPr>
+          <w:rFonts w:ascii="Schibsted Grotesk" w:hAnsi="Schibsted Grotesk"/>
+          <w:b w:val="0"/>
+          <w:i w:val="0"/>
+          <w:color w:val="5A4F41"/>
+          <w:sz w:val="19"/>
+        </w:rPr>
+        <w:t>Human-Computer Interaction &amp; Design · Methods for Human-Centered Computing · Design &amp; Development of an Information System · Web Design · JavaScript · Intro to Cybersecurity · Computer &amp; Information Ethics</w:t>
+      </w:r>
+    </w:p>
+    <w:p>
+      <w:pPr>
+        <w:tabs>
+          <w:tab w:pos="10224" w:val="right"/>
+        </w:tabs>
+        <w:spacing w:before="100"/>
+      </w:pPr>
+      <w:r>
+        <w:rPr>
+          <w:rFonts w:ascii="Fraunces" w:hAnsi="Fraunces"/>
+          <w:b/>
+          <w:i w:val="0"/>
+          <w:color w:val="211B14"/>
+          <w:sz w:val="24"/>
+        </w:rPr>
+        <w:t>Allegan County Area Technical &amp; Education Center</w:t>
+      </w:r>
+      <w:r>
+        <w:rPr>
+          <w:rFonts w:ascii="Space Mono" w:hAnsi="Space Mono"/>
+          <w:b w:val="0"/>
+          <w:i w:val="0"/>
+          <w:color w:val="5A4F41"/>
+          <w:sz w:val="16"/>
+        </w:rPr>
+        <w:tab/>
+        <w:t>Sep 2021 – May 2022</w:t>
+      </w:r>
+    </w:p>
+    <w:p>
+      <w:pPr>
+        <w:spacing w:after="0"/>
+      </w:pPr>
+      <w:r>
+        <w:rPr>
+          <w:rFonts w:ascii="Schibsted Grotesk" w:hAnsi="Schibsted Grotesk"/>
+          <w:b w:val="0"/>
+          <w:i/>
+          <w:color w:val="5A4F41"/>
+          <w:sz w:val="19"/>
+        </w:rPr>
+        <w:t>Computer Information Systems</w:t>
+      </w:r>
+    </w:p>
+    <w:p>
+      <w:pPr>
+        <w:spacing w:after="0"/>
+      </w:pPr>
+      <w:r>
+        <w:rPr>
+          <w:rFonts w:ascii="Space Mono" w:hAnsi="Space Mono"/>
+          <w:b w:val="0"/>
+          <w:i w:val="0"/>
+          <w:color w:val="5A4F41"/>
+          <w:sz w:val="16"/>
+        </w:rPr>
+        <w:t>Allegan, Michigan</w:t>
+      </w:r>
+    </w:p>
+    <w:p>
+      <w:pPr>
+        <w:spacing w:after="50"/>
+        <w:ind w:left="317" w:hanging="317"/>
+      </w:pPr>
+      <w:r>
+        <w:rPr>
+          <w:rFonts w:ascii="Schibsted Grotesk" w:hAnsi="Schibsted Grotesk"/>
+          <w:b/>
+          <w:i w:val="0"/>
+          <w:color w:val="F4502A"/>
+          <w:sz w:val="20"/>
+        </w:rPr>
+        <w:t xml:space="preserve">•  </w:t>
+      </w:r>
+      <w:r>
+        <w:rPr>
+          <w:rFonts w:ascii="Schibsted Grotesk" w:hAnsi="Schibsted Grotesk"/>
+          <w:b w:val="0"/>
+          <w:i w:val="0"/>
+          <w:color w:val="5A4F41"/>
+          <w:sz w:val="20"/>
+        </w:rPr>
+        <w:t>Installed, configured, and administered network infrastructure end-to-end, and built/modified computer hardware, software, and operating systems to spec.</w:t>
+      </w:r>
+    </w:p>
+    <w:p>
+      <w:pPr>
+        <w:spacing w:before="220" w:after="80"/>
+        <w:pBdr>
+          <w:bottom w:val="single" w:sz="6" w:space="3" w:color="2D4DF5"/>
+        </w:pBdr>
+      </w:pPr>
+      <w:r>
+        <w:rPr>
+          <w:rFonts w:ascii="Space Mono" w:hAnsi="Space Mono"/>
+          <w:b/>
+          <w:i w:val="0"/>
+          <w:color w:val="2D4DF5"/>
+          <w:sz w:val="21"/>
+        </w:rPr>
+        <w:t>EXPERIENCE</w:t>
+      </w:r>
+    </w:p>
+    <w:p>
+      <w:pPr>
+        <w:spacing w:before="80" w:after="0"/>
+      </w:pPr>
+      <w:r>
+        <w:rPr>
+          <w:rFonts w:ascii="Space Mono" w:hAnsi="Space Mono"/>
+          <w:b w:val="0"/>
+          <w:i w:val="0"/>
+          <w:color w:val="5A4F41"/>
+          <w:sz w:val="16"/>
+        </w:rPr>
+        <w:t>Tire Rack · South Bend, Indiana (hybrid)</w:t>
+      </w:r>
+    </w:p>
+    <w:p>
+      <w:pPr>
+        <w:tabs>
+          <w:tab w:pos="10224" w:val="right"/>
+        </w:tabs>
+        <w:spacing w:before="100"/>
+      </w:pPr>
+      <w:r>
+        <w:rPr>
+          <w:rFonts w:ascii="Fraunces" w:hAnsi="Fraunces"/>
+          <w:b/>
+          <w:i w:val="0"/>
+          <w:color w:val="211B14"/>
+          <w:sz w:val="24"/>
+        </w:rPr>
+        <w:t>Innovation &amp; AI Intern</w:t>
+      </w:r>
+      <w:r>
+        <w:rPr>
+          <w:rFonts w:ascii="Space Mono" w:hAnsi="Space Mono"/>
+          <w:b w:val="0"/>
+          <w:i w:val="0"/>
+          <w:color w:val="5A4F41"/>
+          <w:sz w:val="16"/>
+        </w:rPr>
+        <w:tab/>
+        <w:t>Jun 2026 – Present</w:t>
+      </w:r>
+    </w:p>
+    <w:p>
+      <w:pPr>
+        <w:spacing w:after="50"/>
+        <w:ind w:left="317" w:hanging="317"/>
+      </w:pPr>
+      <w:r>
+        <w:rPr>
+          <w:rFonts w:ascii="Schibsted Grotesk" w:hAnsi="Schibsted Grotesk"/>
+          <w:b/>
+          <w:i w:val="0"/>
+          <w:color w:val="2D4DF5"/>
+          <w:sz w:val="20"/>
+        </w:rPr>
+        <w:t xml:space="preserve">•  </w:t>
+      </w:r>
+      <w:r>
+        <w:rPr>
+          <w:rFonts w:ascii="Schibsted Grotesk" w:hAnsi="Schibsted Grotesk"/>
+          <w:b w:val="0"/>
+          <w:i w:val="0"/>
+          <w:color w:val="5A4F41"/>
+          <w:sz w:val="20"/>
+        </w:rPr>
+        <w:t>Designed, built, and deployed a production SMS gateway (Python / FastAPI on Cloud Run) that lets customers text Tire Rack's TRACI AI agent — inbound webhook → async worker → agent call → replies rendered into SMS via Twilio; backed by Redis/SQS, 42 tests, and keyless CI/CD.</w:t>
+      </w:r>
+    </w:p>
+    <w:p>
+      <w:pPr>
+        <w:spacing w:after="50"/>
+        <w:ind w:left="317" w:hanging="317"/>
+      </w:pPr>
+      <w:r>
+        <w:rPr>
+          <w:rFonts w:ascii="Schibsted Grotesk" w:hAnsi="Schibsted Grotesk"/>
+          <w:b/>
+          <w:i w:val="0"/>
+          <w:color w:val="2D4DF5"/>
+          <w:sz w:val="20"/>
+        </w:rPr>
+        <w:t xml:space="preserve">•  </w:t>
+      </w:r>
+      <w:r>
+        <w:rPr>
+          <w:rFonts w:ascii="Schibsted Grotesk" w:hAnsi="Schibsted Grotesk"/>
+          <w:b w:val="0"/>
+          <w:i w:val="0"/>
+          <w:color w:val="5A4F41"/>
+          <w:sz w:val="20"/>
+        </w:rPr>
+        <w:t>Cracked its core blocker — the web-only vehicle picker can't render over SMS — with a numbered year/make/model drill-down over the site's YMMV APIs that auto-supplies the factory tire size.</w:t>
+      </w:r>
+    </w:p>
+    <w:p>
+      <w:pPr>
+        <w:spacing w:after="50"/>
+        <w:ind w:left="317" w:hanging="317"/>
+      </w:pPr>
+      <w:r>
+        <w:rPr>
+          <w:rFonts w:ascii="Schibsted Grotesk" w:hAnsi="Schibsted Grotesk"/>
+          <w:b/>
+          <w:i w:val="0"/>
+          <w:color w:val="2D4DF5"/>
+          <w:sz w:val="20"/>
+        </w:rPr>
+        <w:t xml:space="preserve">•  </w:t>
+      </w:r>
+      <w:r>
+        <w:rPr>
+          <w:rFonts w:ascii="Schibsted Grotesk" w:hAnsi="Schibsted Grotesk"/>
+          <w:b w:val="0"/>
+          <w:i w:val="0"/>
+          <w:color w:val="5A4F41"/>
+          <w:sz w:val="20"/>
+        </w:rPr>
+        <w:t>Built Karst, a Next.js + Firebase caving field-guide app (web + Android) with a privacy-first map — shipped fast with AI-assisted development.</w:t>
+      </w:r>
+    </w:p>
+    <w:p>
+      <w:pPr>
+        <w:spacing w:before="80" w:after="0"/>
+      </w:pPr>
+      <w:r>
+        <w:rPr>
+          <w:rFonts w:ascii="Space Mono" w:hAnsi="Space Mono"/>
+          <w:b w:val="0"/>
+          <w:i w:val="0"/>
+          <w:color w:val="5A4F41"/>
+          <w:sz w:val="16"/>
+        </w:rPr>
+        <w:t>University Information Technology Services · Indiana University</w:t>
+      </w:r>
+    </w:p>
+    <w:p>
+      <w:pPr>
+        <w:tabs>
+          <w:tab w:pos="10224" w:val="right"/>
+        </w:tabs>
+        <w:spacing w:before="100"/>
+      </w:pPr>
+      <w:r>
+        <w:rPr>
+          <w:rFonts w:ascii="Fraunces" w:hAnsi="Fraunces"/>
+          <w:b/>
+          <w:i w:val="0"/>
+          <w:color w:val="211B14"/>
+          <w:sz w:val="24"/>
+        </w:rPr>
+        <w:t>SCIPS Consultant Supervisor</w:t>
+      </w:r>
+      <w:r>
+        <w:rPr>
+          <w:rFonts w:ascii="Space Mono" w:hAnsi="Space Mono"/>
+          <w:b w:val="0"/>
+          <w:i w:val="0"/>
+          <w:color w:val="5A4F41"/>
+          <w:sz w:val="16"/>
+        </w:rPr>
+        <w:tab/>
+        <w:t>Aug 2024 – Feb 2026</w:t>
+      </w:r>
+    </w:p>
+    <w:p>
+      <w:pPr>
+        <w:spacing w:after="50"/>
+        <w:ind w:left="317" w:hanging="317"/>
+      </w:pPr>
+      <w:r>
+        <w:rPr>
+          <w:rFonts w:ascii="Schibsted Grotesk" w:hAnsi="Schibsted Grotesk"/>
+          <w:b/>
+          <w:i w:val="0"/>
+          <w:color w:val="2D4DF5"/>
+          <w:sz w:val="20"/>
+        </w:rPr>
+        <w:t xml:space="preserve">•  </w:t>
+      </w:r>
+      <w:r>
+        <w:rPr>
+          <w:rFonts w:ascii="Schibsted Grotesk" w:hAnsi="Schibsted Grotesk"/>
+          <w:b w:val="0"/>
+          <w:i w:val="0"/>
+          <w:color w:val="5A4F41"/>
+          <w:sz w:val="20"/>
+        </w:rPr>
+        <w:t>Led the Tech Team and walk-in Support Center, coaching consultants through complex technical and customer issues.</w:t>
+      </w:r>
+    </w:p>
+    <w:p>
+      <w:pPr>
+        <w:spacing w:after="50"/>
+        <w:ind w:left="317" w:hanging="317"/>
+      </w:pPr>
+      <w:r>
+        <w:rPr>
+          <w:rFonts w:ascii="Schibsted Grotesk" w:hAnsi="Schibsted Grotesk"/>
+          <w:b/>
+          <w:i w:val="0"/>
+          <w:color w:val="2D4DF5"/>
+          <w:sz w:val="20"/>
+        </w:rPr>
+        <w:t xml:space="preserve">•  </w:t>
+      </w:r>
+      <w:r>
+        <w:rPr>
+          <w:rFonts w:ascii="Schibsted Grotesk" w:hAnsi="Schibsted Grotesk"/>
+          <w:b w:val="0"/>
+          <w:i w:val="0"/>
+          <w:color w:val="5A4F41"/>
+          <w:sz w:val="20"/>
+        </w:rPr>
+        <w:t>Drove campus-wide support for labs, printers, and classroom tech — from preemptive checks to urgent in-person requests.</w:t>
+      </w:r>
+    </w:p>
+    <w:p>
+      <w:pPr>
+        <w:tabs>
+          <w:tab w:pos="10224" w:val="right"/>
+        </w:tabs>
+        <w:spacing w:before="100"/>
+      </w:pPr>
+      <w:r>
+        <w:rPr>
+          <w:rFonts w:ascii="Fraunces" w:hAnsi="Fraunces"/>
+          <w:b/>
+          <w:i w:val="0"/>
+          <w:color w:val="211B14"/>
+          <w:sz w:val="24"/>
+        </w:rPr>
+        <w:t>TCC Tech Team</w:t>
+      </w:r>
+      <w:r>
+        <w:rPr>
+          <w:rFonts w:ascii="Space Mono" w:hAnsi="Space Mono"/>
+          <w:b w:val="0"/>
+          <w:i w:val="0"/>
+          <w:color w:val="5A4F41"/>
+          <w:sz w:val="16"/>
+        </w:rPr>
+        <w:tab/>
+        <w:t>Nov 2023 – May 2024</w:t>
+      </w:r>
+    </w:p>
+    <w:p>
+      <w:pPr>
+        <w:spacing w:after="50"/>
+        <w:ind w:left="317" w:hanging="317"/>
+      </w:pPr>
+      <w:r>
+        <w:rPr>
+          <w:rFonts w:ascii="Schibsted Grotesk" w:hAnsi="Schibsted Grotesk"/>
+          <w:b/>
+          <w:i w:val="0"/>
+          <w:color w:val="2D4DF5"/>
+          <w:sz w:val="20"/>
+        </w:rPr>
+        <w:t xml:space="preserve">•  </w:t>
+      </w:r>
+      <w:r>
+        <w:rPr>
+          <w:rFonts w:ascii="Schibsted Grotesk" w:hAnsi="Schibsted Grotesk"/>
+          <w:b w:val="0"/>
+          <w:i w:val="0"/>
+          <w:color w:val="5A4F41"/>
+          <w:sz w:val="20"/>
+        </w:rPr>
+        <w:t>Resolved client tickets across virtual, in-office, and in-room appointments, and set up wired/wireless connectivity for campus residents.</w:t>
+      </w:r>
+    </w:p>
+    <w:p>
+      <w:pPr>
+        <w:tabs>
+          <w:tab w:pos="10224" w:val="right"/>
+        </w:tabs>
+        <w:spacing w:before="100"/>
+      </w:pPr>
+      <w:r>
+        <w:rPr>
+          <w:rFonts w:ascii="Fraunces" w:hAnsi="Fraunces"/>
+          <w:b/>
+          <w:i w:val="0"/>
+          <w:color w:val="211B14"/>
+          <w:sz w:val="24"/>
+        </w:rPr>
+        <w:t>Technology Center Consultant</w:t>
+      </w:r>
+      <w:r>
+        <w:rPr>
+          <w:rFonts w:ascii="Space Mono" w:hAnsi="Space Mono"/>
+          <w:b w:val="0"/>
+          <w:i w:val="0"/>
+          <w:color w:val="5A4F41"/>
+          <w:sz w:val="16"/>
+        </w:rPr>
+        <w:tab/>
+        <w:t>Sep 2023 – Nov 2023</w:t>
+      </w:r>
+    </w:p>
+    <w:p>
+      <w:pPr>
+        <w:spacing w:after="50"/>
+        <w:ind w:left="317" w:hanging="317"/>
+      </w:pPr>
+      <w:r>
+        <w:rPr>
+          <w:rFonts w:ascii="Schibsted Grotesk" w:hAnsi="Schibsted Grotesk"/>
+          <w:b/>
+          <w:i w:val="0"/>
+          <w:color w:val="2D4DF5"/>
+          <w:sz w:val="20"/>
+        </w:rPr>
+        <w:t xml:space="preserve">•  </w:t>
+      </w:r>
+      <w:r>
+        <w:rPr>
+          <w:rFonts w:ascii="Schibsted Grotesk" w:hAnsi="Schibsted Grotesk"/>
+          <w:b w:val="0"/>
+          <w:i w:val="0"/>
+          <w:color w:val="5A4F41"/>
+          <w:sz w:val="20"/>
+        </w:rPr>
+        <w:t>Troubleshot software and printer issues for walk-in clients and kept lab equipment stocked and organized.</w:t>
+      </w:r>
+    </w:p>
+    <w:p>
+      <w:pPr>
+        <w:spacing w:after="50"/>
+        <w:ind w:left="317" w:hanging="317"/>
+      </w:pPr>
+      <w:r>
+        <w:rPr>
+          <w:rFonts w:ascii="Schibsted Grotesk" w:hAnsi="Schibsted Grotesk"/>
+          <w:b/>
+          <w:i w:val="0"/>
+          <w:color w:val="2D4DF5"/>
+          <w:sz w:val="20"/>
+        </w:rPr>
+        <w:t xml:space="preserve">•  </w:t>
+      </w:r>
+      <w:r>
+        <w:rPr>
+          <w:rFonts w:ascii="Schibsted Grotesk" w:hAnsi="Schibsted Grotesk"/>
+          <w:b w:val="0"/>
+          <w:i w:val="0"/>
+          <w:color w:val="5A4F41"/>
+          <w:sz w:val="20"/>
+        </w:rPr>
+        <w:t>Logged and tracked issues in ticketing systems, producing customer and lab reports.</w:t>
+      </w:r>
+    </w:p>
+    <w:p>
+      <w:pPr>
+        <w:spacing w:before="220" w:after="80"/>
+        <w:pBdr>
+          <w:bottom w:val="single" w:sz="6" w:space="3" w:color="C08800"/>
+        </w:pBdr>
+      </w:pPr>
+      <w:r>
+        <w:rPr>
+          <w:rFonts w:ascii="Space Mono" w:hAnsi="Space Mono"/>
+          <w:b/>
+          <w:i w:val="0"/>
+          <w:color w:val="C08800"/>
+          <w:sz w:val="21"/>
+        </w:rPr>
+        <w:t>SKILLS</w:t>
+      </w:r>
+    </w:p>
+    <w:p>
+      <w:pPr>
+        <w:spacing w:after="40"/>
+      </w:pPr>
+      <w:r>
+        <w:rPr>
+          <w:rFonts w:ascii="Space Mono" w:hAnsi="Space Mono"/>
+          <w:b/>
+          <w:i w:val="0"/>
+          <w:color w:val="211B14"/>
+          <w:sz w:val="17"/>
+        </w:rPr>
+        <w:t xml:space="preserve">Languages:  </w:t>
+      </w:r>
+      <w:r>
+        <w:rPr>
+          <w:rFonts w:ascii="Schibsted Grotesk" w:hAnsi="Schibsted Grotesk"/>
+          <w:b w:val="0"/>
+          <w:i w:val="0"/>
+          <w:color w:val="5A4F41"/>
+          <w:sz w:val="20"/>
+        </w:rPr>
+        <w:t>JavaScript, Python, PHP, MySQL</w:t>
+      </w:r>
+    </w:p>
+    <w:p>
+      <w:pPr>
+        <w:spacing w:after="40"/>
+      </w:pPr>
+      <w:r>
+        <w:rPr>
+          <w:rFonts w:ascii="Space Mono" w:hAnsi="Space Mono"/>
+          <w:b/>
+          <w:i w:val="0"/>
+          <w:color w:val="211B14"/>
+          <w:sz w:val="17"/>
+        </w:rPr>
+        <w:t xml:space="preserve">Web &amp; Frameworks:  </w:t>
+      </w:r>
+      <w:r>
+        <w:rPr>
+          <w:rFonts w:ascii="Schibsted Grotesk" w:hAnsi="Schibsted Grotesk"/>
+          <w:b w:val="0"/>
+          <w:i w:val="0"/>
+          <w:color w:val="5A4F41"/>
+          <w:sz w:val="20"/>
+        </w:rPr>
+        <w:t>React / Next.js, HTML, CSS, Firebase, Git</w:t>
+      </w:r>
+    </w:p>
+    <w:p>
+      <w:pPr>
+        <w:spacing w:after="40"/>
+      </w:pPr>
+      <w:r>
+        <w:rPr>
+          <w:rFonts w:ascii="Space Mono" w:hAnsi="Space Mono"/>
+          <w:b/>
+          <w:i w:val="0"/>
+          <w:color w:val="211B14"/>
+          <w:sz w:val="17"/>
+        </w:rPr>
+        <w:t xml:space="preserve">Design:  </w:t>
+      </w:r>
+      <w:r>
+        <w:rPr>
+          <w:rFonts w:ascii="Schibsted Grotesk" w:hAnsi="Schibsted Grotesk"/>
+          <w:b w:val="0"/>
+          <w:i w:val="0"/>
+          <w:color w:val="5A4F41"/>
+          <w:sz w:val="20"/>
+        </w:rPr>
+        <w:t>Figma, UX &amp; HCI Design, Web Design, Tableau</w:t>
+      </w:r>
+    </w:p>
+    <w:p>
+      <w:pPr>
+        <w:spacing w:after="40"/>
+      </w:pPr>
+      <w:r>
+        <w:rPr>
+          <w:rFonts w:ascii="Space Mono" w:hAnsi="Space Mono"/>
+          <w:b/>
+          <w:i w:val="0"/>
+          <w:color w:val="211B14"/>
+          <w:sz w:val="17"/>
+        </w:rPr>
+        <w:t xml:space="preserve">Operating Systems:  </w:t>
+      </w:r>
+      <w:r>
+        <w:rPr>
+          <w:rFonts w:ascii="Schibsted Grotesk" w:hAnsi="Schibsted Grotesk"/>
+          <w:b w:val="0"/>
+          <w:i w:val="0"/>
+          <w:color w:val="5A4F41"/>
+          <w:sz w:val="20"/>
+        </w:rPr>
+        <w:t>Linux, macOS, Windows 10/11, Windows Server</w:t>
+      </w:r>
+    </w:p>
+    <w:p>
+      <w:pPr>
+        <w:spacing w:after="40"/>
+      </w:pPr>
+      <w:r>
+        <w:rPr>
+          <w:rFonts w:ascii="Space Mono" w:hAnsi="Space Mono"/>
+          <w:b/>
+          <w:i w:val="0"/>
+          <w:color w:val="211B14"/>
+          <w:sz w:val="17"/>
+        </w:rPr>
+        <w:t xml:space="preserve">Tools:  </w:t>
+      </w:r>
+      <w:r>
+        <w:rPr>
+          <w:rFonts w:ascii="Schibsted Grotesk" w:hAnsi="Schibsted Grotesk"/>
+          <w:b w:val="0"/>
+          <w:i w:val="0"/>
+          <w:color w:val="5A4F41"/>
+          <w:sz w:val="20"/>
+        </w:rPr>
+        <w:t>Active Directory, Office365, VirtualBox, VMware, VS Code, WSL</w:t>
+      </w:r>
+    </w:p>
+    <w:p>
+      <w:pPr>
+        <w:spacing w:before="220" w:after="80"/>
+        <w:pBdr>
+          <w:bottom w:val="single" w:sz="6" w:space="3" w:color="82990A"/>
+        </w:pBdr>
+      </w:pPr>
+      <w:r>
+        <w:rPr>
+          <w:rFonts w:ascii="Space Mono" w:hAnsi="Space Mono"/>
+          <w:b/>
+          <w:i w:val="0"/>
+          <w:color w:val="82990A"/>
+          <w:sz w:val="21"/>
+        </w:rPr>
+        <w:t>CERTIFICATIONS</w:t>
+      </w:r>
+    </w:p>
+    <w:p>
+      <w:pPr>
+        <w:spacing w:after="50"/>
+        <w:ind w:left="317" w:hanging="317"/>
+      </w:pPr>
+      <w:r>
+        <w:rPr>
+          <w:rFonts w:ascii="Schibsted Grotesk" w:hAnsi="Schibsted Grotesk"/>
+          <w:b/>
+          <w:i w:val="0"/>
+          <w:color w:val="82990A"/>
+          <w:sz w:val="20"/>
+        </w:rPr>
+        <w:t xml:space="preserve">•  </w:t>
+      </w:r>
+      <w:r>
+        <w:rPr>
+          <w:rFonts w:ascii="Schibsted Grotesk" w:hAnsi="Schibsted Grotesk"/>
+          <w:b w:val="0"/>
+          <w:i w:val="0"/>
+          <w:color w:val="5A4F41"/>
+          <w:sz w:val="20"/>
+        </w:rPr>
+        <w:t>Certiport ITS — Computational Thinking, Cybersecurity, Device Configuration &amp; Management, Network Security &amp; Networking</w:t>
+      </w:r>
+    </w:p>
+    <w:p>
+      <w:pPr>
+        <w:spacing w:after="50"/>
+        <w:ind w:left="317" w:hanging="317"/>
+      </w:pPr>
+      <w:r>
+        <w:rPr>
+          <w:rFonts w:ascii="Schibsted Grotesk" w:hAnsi="Schibsted Grotesk"/>
+          <w:b/>
+          <w:i w:val="0"/>
+          <w:color w:val="82990A"/>
+          <w:sz w:val="20"/>
+        </w:rPr>
+        <w:t xml:space="preserve">•  </w:t>
+      </w:r>
+      <w:r>
+        <w:rPr>
+          <w:rFonts w:ascii="Schibsted Grotesk" w:hAnsi="Schibsted Grotesk"/>
+          <w:b w:val="0"/>
+          <w:i w:val="0"/>
+          <w:color w:val="5A4F41"/>
+          <w:sz w:val="20"/>
+        </w:rPr>
+        <w:t>Cisco Certified Support Technician — Cybersecurity</w:t>
+      </w:r>
+    </w:p>
+    <w:p>
+      <w:pPr>
+        <w:spacing w:after="50"/>
+        <w:ind w:left="317" w:hanging="317"/>
+      </w:pPr>
+      <w:r>
+        <w:rPr>
+          <w:rFonts w:ascii="Schibsted Grotesk" w:hAnsi="Schibsted Grotesk"/>
+          <w:b/>
+          <w:i w:val="0"/>
+          <w:color w:val="82990A"/>
+          <w:sz w:val="20"/>
+        </w:rPr>
+        <w:t xml:space="preserve">•  </w:t>
+      </w:r>
+      <w:r>
+        <w:rPr>
+          <w:rFonts w:ascii="Schibsted Grotesk" w:hAnsi="Schibsted Grotesk"/>
+          <w:b w:val="0"/>
+          <w:i w:val="0"/>
+          <w:color w:val="5A4F41"/>
+          <w:sz w:val="20"/>
+        </w:rPr>
+        <w:t>Cisco IT Essentials</w:t>
+      </w:r>
+    </w:p>
+    <w:p>
+      <w:pPr>
+        <w:spacing w:after="50"/>
+        <w:ind w:left="317" w:hanging="317"/>
+      </w:pPr>
+      <w:r>
+        <w:rPr>
+          <w:rFonts w:ascii="Schibsted Grotesk" w:hAnsi="Schibsted Grotesk"/>
+          <w:b/>
+          <w:i w:val="0"/>
+          <w:color w:val="82990A"/>
+          <w:sz w:val="20"/>
+        </w:rPr>
+        <w:t xml:space="preserve">•  </w:t>
+      </w:r>
+      <w:r>
+        <w:rPr>
+          <w:rFonts w:ascii="Schibsted Grotesk" w:hAnsi="Schibsted Grotesk"/>
+          <w:b w:val="0"/>
+          <w:i w:val="0"/>
+          <w:color w:val="5A4F41"/>
+          <w:sz w:val="20"/>
+        </w:rPr>
+        <w:t>TestOut PC Pro</w:t>
+      </w:r>
+    </w:p>
+    <w:p>
+      <w:pPr>
+        <w:spacing w:before="220" w:after="80"/>
+        <w:pBdr>
+          <w:bottom w:val="single" w:sz="6" w:space="3" w:color="D8539B"/>
+        </w:pBdr>
+      </w:pPr>
+      <w:r>
+        <w:rPr>
+          <w:rFonts w:ascii="Space Mono" w:hAnsi="Space Mono"/>
+          <w:b/>
+          <w:i w:val="0"/>
+          <w:color w:val="D8539B"/>
+          <w:sz w:val="21"/>
+        </w:rPr>
+        <w:t>OFF THE CLOCK</w:t>
+      </w:r>
+    </w:p>
+    <w:p>
+      <w:r>
+        <w:rPr>
+          <w:rFonts w:ascii="Schibsted Grotesk" w:hAnsi="Schibsted Grotesk"/>
+          <w:b w:val="0"/>
+          <w:i w:val="0"/>
+          <w:color w:val="5A4F41"/>
+          <w:sz w:val="19"/>
+        </w:rPr>
+        <w:t>Caving · Coffee · Gym · Hiking · PC building · Custom keyboards · Plants · Reading · Swimming</w:t>
+      </w:r>
+    </w:p>
     <w:sectPr>
       <w:pgSz w:w="12240" w:h="15840"/>
-      <w:pgMar w:top="720" w:right="864" w:bottom="648" w:left="864" w:header="720" w:footer="720" w:gutter="0"/>
+      <w:pgMar w:top="792" w:right="1008" w:bottom="720" w:left="1008" w:header="720" w:footer="720" w:gutter="0"/>
       <w:cols w:space="720"/>
       <w:docGrid w:linePitch="360"/>
     </w:sectPr>
@@ -1392,12 +1288,12 @@
     <w:qFormat/>
     <w:rsid w:val="00FC693F"/>
     <w:pPr>
-      <w:spacing w:before="0" w:after="0" w:line="254" w:lineRule="auto"/>
+      <w:spacing w:before="0" w:after="0" w:line="269" w:lineRule="auto"/>
     </w:pPr>
     <w:rPr>
       <w:rFonts w:ascii="Schibsted Grotesk" w:hAnsi="Schibsted Grotesk"/>
       <w:color w:val="5A4F41"/>
-      <w:sz w:val="19"/>
+      <w:sz w:val="20"/>
     </w:rPr>
   </w:style>
   <w:style w:type="paragraph" w:styleId="Header">

</xml_diff>